<commit_message>
fix: Irreführende Bezeichnungen korrigiert (stream_labels->stream_meta, balance_ids -> balance_names
</commit_message>
<xml_diff>
--- a/Projektbeschreibung.docx
+++ b/Projektbeschreibung.docx
@@ -22,15 +22,7 @@
         <w:jc w:val="both"/>
       </w:pPr>
       <w:r>
-        <w:t xml:space="preserve">Dieses Projekt hat als entferntes Ziel, ein modulares, </w:t>
-      </w:r>
-      <w:proofErr w:type="spellStart"/>
-      <w:r>
-        <w:t>python</w:t>
-      </w:r>
-      <w:proofErr w:type="spellEnd"/>
-      <w:r>
-        <w:t>-basiertes Tool für die Rekonziliation von Prozessdaten (Chemische Prozessindustrie) zu erstellen.</w:t>
+        <w:t>Dieses Projekt hat als entferntes Ziel, ein modulares, python-basiertes Tool für die Rekonziliation von Prozessdaten (Chemische Prozessindustrie) zu erstellen.</w:t>
       </w:r>
     </w:p>
     <w:p>
@@ -38,23 +30,7 @@
         <w:jc w:val="both"/>
       </w:pPr>
       <w:r>
-        <w:t xml:space="preserve">Im ersten Schritt soll nun ein sehr einfaches Modell für die Rekonziliation eines kleinen Prozesses erstellt werden, bei dem Stromdaten von N Strömen (Spalten in Worksheet 1 eines Excel-Files) mit k Zeilen (Stundenweise Mittelwerte, z.B. aus Aspen PIMS) </w:t>
-      </w:r>
-      <w:proofErr w:type="spellStart"/>
-      <w:r>
-        <w:t>rekonziliert</w:t>
-      </w:r>
-      <w:proofErr w:type="spellEnd"/>
-      <w:r>
-        <w:t xml:space="preserve"> werden (Matrix X Element k X N), wobei die Matrix A Element M x N die M Bilanz-Relationen zwischen den Strömen enthält und </w:t>
-      </w:r>
-      <w:proofErr w:type="spellStart"/>
-      <w:r>
-        <w:t>entspechend</w:t>
-      </w:r>
-      <w:proofErr w:type="spellEnd"/>
-      <w:r>
-        <w:t xml:space="preserve"> die Einträge -1 0 und 1 enthalten kann.</w:t>
+        <w:t>Im ersten Schritt soll nun ein sehr einfaches Modell für die Rekonziliation eines kleinen Prozesses erstellt werden, bei dem Stromdaten von N Strömen (Spalten in Worksheet 1 eines Excel-Files) mit k Zeilen (Stundenweise Mittelwerte, z.B. aus Aspen PIMS) rekonziliert werden (Matrix X Element k X N), wobei die Matrix A Element M x N die M Bilanz-Relationen zwischen den Strömen enthält und entspechend die Einträge -1 0 und 1 enthalten kann.</w:t>
       </w:r>
     </w:p>
     <w:p>
@@ -65,15 +41,7 @@
         <w:t xml:space="preserve">Die Ströme sollen im ersten Worksheet eines Excel-Files enthalten sein, wobei die oberste Zeile die Strom-Nr., die zweite Zeile die relativen Unsicherheiten </w:t>
       </w:r>
       <w:r>
-        <w:t xml:space="preserve">RHO = </w:t>
-      </w:r>
-      <w:proofErr w:type="spellStart"/>
-      <w:r>
-        <w:t>sigma</w:t>
-      </w:r>
-      <w:proofErr w:type="spellEnd"/>
-      <w:r>
-        <w:t xml:space="preserve"> / x (korrekt?), RHO Element 1 X N,</w:t>
+        <w:t>RHO = sigma / x (korrekt?), RHO Element 1 X N,</w:t>
       </w:r>
       <w:r>
         <w:t xml:space="preserve"> und ab Zeile 3 die Stromdaten in kg h-1 enthalten soll.</w:t>
@@ -110,15 +78,7 @@
         <w:jc w:val="both"/>
       </w:pPr>
       <w:r>
-        <w:t xml:space="preserve">Bitte lies die Quelle </w:t>
-      </w:r>
-      <w:proofErr w:type="spellStart"/>
-      <w:r>
-        <w:t>Narashimhan</w:t>
-      </w:r>
-      <w:proofErr w:type="spellEnd"/>
-      <w:r>
-        <w:t xml:space="preserve"> und Jordache und extrahiere die relevanten Stellen</w:t>
+        <w:t>Bitte lies die Quelle Narashimhan und Jordache und extrahiere die relevanten Stellen</w:t>
       </w:r>
       <w:r>
         <w:t xml:space="preserve"> für das Problem. Fasse </w:t>
@@ -158,15 +118,7 @@
         <w:t>, D.h. M = 1.</w:t>
       </w:r>
       <w:r>
-        <w:t xml:space="preserve"> Erstelle hierfür ein Demo-Excel-File </w:t>
-      </w:r>
-      <w:proofErr w:type="spellStart"/>
-      <w:r>
-        <w:t>entspreechend</w:t>
-      </w:r>
-      <w:proofErr w:type="spellEnd"/>
-      <w:r>
-        <w:t xml:space="preserve"> der oben beschrieben Struktur: </w:t>
+        <w:t xml:space="preserve"> Erstelle hierfür ein Demo-Excel-File entspreechend der oben beschrieben Struktur: </w:t>
       </w:r>
       <w:r>
         <w:t xml:space="preserve">Betrachte nur den Gesamt-Prozess und beziehe die Ströme 4, 5, 16, 14 und 12 </w:t>
@@ -214,32 +166,24 @@
         <w:t xml:space="preserve">sollen um </w:t>
       </w:r>
       <w:r>
-        <w:t xml:space="preserve">die </w:t>
-      </w:r>
-      <w:proofErr w:type="spellStart"/>
-      <w:r>
-        <w:t>jewiligen</w:t>
-      </w:r>
-      <w:proofErr w:type="spellEnd"/>
+        <w:t xml:space="preserve">die jewiligen </w:t>
+      </w:r>
+      <w:r>
+        <w:t>Mittelwert</w:t>
+      </w:r>
+      <w:r>
+        <w:t>e</w:t>
+      </w:r>
+      <w:r>
+        <w:t xml:space="preserve"> streuen</w:t>
+      </w:r>
+      <w:r>
+        <w:t xml:space="preserve"> und</w:t>
+      </w:r>
       <w:r>
         <w:t xml:space="preserve"> </w:t>
       </w:r>
       <w:r>
-        <w:t>Mittelwert</w:t>
-      </w:r>
-      <w:r>
-        <w:t>e</w:t>
-      </w:r>
-      <w:r>
-        <w:t xml:space="preserve"> streuen</w:t>
-      </w:r>
-      <w:r>
-        <w:t xml:space="preserve"> und</w:t>
-      </w:r>
-      <w:r>
-        <w:t xml:space="preserve"> </w:t>
-      </w:r>
-      <w:r>
         <w:t xml:space="preserve">es soll auch ein systematischer Fehler enthalten sein, </w:t>
       </w:r>
       <w:r>
@@ -266,24 +210,11 @@
       <w:r>
         <w:t xml:space="preserve"> Es soll sein k  = 3000, und gegen Ende soll eine größere </w:t>
       </w:r>
-      <w:proofErr w:type="spellStart"/>
-      <w:r>
-        <w:t>Instationarität</w:t>
-      </w:r>
-      <w:proofErr w:type="spellEnd"/>
-      <w:r>
-        <w:t xml:space="preserve"> </w:t>
-      </w:r>
-      <w:r>
-        <w:t xml:space="preserve">in der Bilanz </w:t>
-      </w:r>
-      <w:proofErr w:type="spellStart"/>
-      <w:r>
-        <w:t>auftreteten</w:t>
-      </w:r>
-      <w:proofErr w:type="spellEnd"/>
-      <w:r>
-        <w:t>.</w:t>
+      <w:r>
+        <w:t xml:space="preserve">Instationarität </w:t>
+      </w:r>
+      <w:r>
+        <w:t>in der Bilanz auftreteten.</w:t>
       </w:r>
     </w:p>
     <w:p>
@@ -387,13 +318,8 @@
         <w:jc w:val="both"/>
       </w:pPr>
       <w:r>
-        <w:t>S4          </w:t>
-      </w:r>
-      <w:proofErr w:type="spellStart"/>
-      <w:r>
-        <w:t>Rohbutan</w:t>
-      </w:r>
-      <w:proofErr w:type="spellEnd"/>
+        <w:t>S4          Rohbutan</w:t>
+      </w:r>
       <w:r>
         <w:tab/>
       </w:r>
@@ -416,14 +342,12 @@
         </w:rPr>
         <w:t>S5          </w:t>
       </w:r>
-      <w:proofErr w:type="spellStart"/>
       <w:r>
         <w:rPr>
           <w:lang w:val="en-US"/>
         </w:rPr>
         <w:t>Synthesegas</w:t>
       </w:r>
-      <w:proofErr w:type="spellEnd"/>
       <w:r>
         <w:rPr>
           <w:lang w:val="en-US"/>
@@ -480,16 +404,8 @@
           <w:lang w:val="en-US"/>
         </w:rPr>
         <w:tab/>
-        <w:t xml:space="preserve"> </w:t>
-      </w:r>
-      <w:proofErr w:type="spellStart"/>
-      <w:r>
-        <w:rPr>
-          <w:lang w:val="en-US"/>
-        </w:rPr>
-        <w:t>Kreisgas</w:t>
-      </w:r>
-      <w:proofErr w:type="spellEnd"/>
+        <w:t xml:space="preserve"> Kreisgas</w:t>
+      </w:r>
       <w:r>
         <w:rPr>
           <w:lang w:val="en-US"/>
@@ -574,21 +490,7 @@
           <w:lang w:val="en-US"/>
         </w:rPr>
         <w:tab/>
-        <w:t xml:space="preserve"> </w:t>
-      </w:r>
-      <w:proofErr w:type="spellStart"/>
-      <w:r>
-        <w:rPr>
-          <w:lang w:val="en-US"/>
-        </w:rPr>
-        <w:t>Valeraldehyd</w:t>
-      </w:r>
-      <w:proofErr w:type="spellEnd"/>
-      <w:r>
-        <w:rPr>
-          <w:lang w:val="en-US"/>
-        </w:rPr>
-        <w:t>                </w:t>
+        <w:t xml:space="preserve"> Valeraldehyd                </w:t>
       </w:r>
       <w:r>
         <w:rPr>
@@ -686,15 +588,7 @@
         <w:t>Es sol</w:t>
       </w:r>
       <w:r>
-        <w:t xml:space="preserve">len zunächst Lösungen für drei Tasks erstellt werden. Bitte erstelle einen </w:t>
-      </w:r>
-      <w:proofErr w:type="spellStart"/>
-      <w:r>
-        <w:t>Vorschla</w:t>
-      </w:r>
-      <w:proofErr w:type="spellEnd"/>
-      <w:r>
-        <w:t xml:space="preserve"> unter Beachtung des modularen Aufbaus des Projektes, so dass es später ggf. erweitert werden kann. Die Umsetzung soll möglichst mit Matrix-Operationen und simultan erfolgen, und ggf. später durch CUDA beschleunigt werden können.</w:t>
+        <w:t>len zunächst Lösungen für drei Tasks erstellt werden. Bitte erstelle einen Vorschla unter Beachtung des modularen Aufbaus des Projektes, so dass es später ggf. erweitert werden kann. Die Umsetzung soll möglichst mit Matrix-Operationen und simultan erfolgen, und ggf. später durch CUDA beschleunigt werden können.</w:t>
       </w:r>
     </w:p>
     <w:p>
@@ -738,15 +632,7 @@
         </w:numPr>
       </w:pPr>
       <w:r>
-        <w:t xml:space="preserve">Bearbeiten der Daten, z.B. Herausfiltern von </w:t>
-      </w:r>
-      <w:proofErr w:type="spellStart"/>
-      <w:r>
-        <w:t>Instationaritäten</w:t>
-      </w:r>
-      <w:proofErr w:type="spellEnd"/>
-      <w:r>
-        <w:t xml:space="preserve"> für die kontinuierliche Massenbilanz </w:t>
+        <w:t xml:space="preserve">Bearbeiten der Daten, z.B. Herausfiltern von Instationaritäten für die kontinuierliche Massenbilanz </w:t>
       </w:r>
     </w:p>
     <w:p>
@@ -765,23 +651,7 @@
       </w:r>
       <w:r>
         <w:lastRenderedPageBreak/>
-        <w:t xml:space="preserve">optionaler </w:t>
-      </w:r>
-      <w:proofErr w:type="spellStart"/>
-      <w:r>
-        <w:t>Regularisations</w:t>
-      </w:r>
-      <w:proofErr w:type="spellEnd"/>
-      <w:r>
-        <w:t xml:space="preserve">-Parameter als </w:t>
-      </w:r>
-      <w:proofErr w:type="spellStart"/>
-      <w:r>
-        <w:t>parameter</w:t>
-      </w:r>
-      <w:proofErr w:type="spellEnd"/>
-      <w:r>
-        <w:t xml:space="preserve"> übergeben werden können, der die Numerik stabilisiert. </w:t>
+        <w:t xml:space="preserve">optionaler Regularisations-Parameter als parameter übergeben werden können, der die Numerik stabilisiert. </w:t>
       </w:r>
       <w:r>
         <w:t>Als Resultat soll erhalten werden</w:t>
@@ -811,15 +681,7 @@
         </w:numPr>
       </w:pPr>
       <w:r>
-        <w:t xml:space="preserve">Sum </w:t>
-      </w:r>
-      <w:proofErr w:type="spellStart"/>
-      <w:r>
-        <w:t>of</w:t>
-      </w:r>
-      <w:proofErr w:type="spellEnd"/>
-      <w:r>
-        <w:t xml:space="preserve"> Squares der Residuale aller Stundenweisen Ma</w:t>
+        <w:t>Sum of Squares der Residuale aller Stundenweisen Ma</w:t>
       </w:r>
       <w:r>
         <w:t>ssenbilanzen</w:t>
@@ -852,20 +714,104 @@
         </w:numPr>
       </w:pPr>
       <w:r>
-        <w:t xml:space="preserve">1x2 </w:t>
-      </w:r>
-      <w:proofErr w:type="spellStart"/>
-      <w:r>
-        <w:t>Mulitplot</w:t>
-      </w:r>
-      <w:proofErr w:type="spellEnd"/>
-      <w:r>
-        <w:t xml:space="preserve"> Rohdaten: Verlauf der der Rohdaten über t, Boxplot für alle Ströme, um die Lage der Daten zu verstehen</w:t>
+        <w:t>1x2 Mulitplot Rohdaten: Verlauf der der Rohdaten über t, Boxplot für alle Ströme, um die Lage der Daten zu verstehen</w:t>
       </w:r>
     </w:p>
     <w:p>
       <w:r>
         <w:t xml:space="preserve"> </w:t>
+      </w:r>
+    </w:p>
+    <w:p>
+      <w:r>
+        <w:t>Aktuelles ToDo</w:t>
+      </w:r>
+    </w:p>
+    <w:p>
+      <w:pPr>
+        <w:pStyle w:val="Listenabsatz"/>
+        <w:numPr>
+          <w:ilvl w:val="0"/>
+          <w:numId w:val="2"/>
+        </w:numPr>
+      </w:pPr>
+      <w:r>
+        <w:t>A-Matrix</w:t>
+      </w:r>
+    </w:p>
+    <w:p>
+      <w:pPr>
+        <w:pStyle w:val="Listenabsatz"/>
+        <w:numPr>
+          <w:ilvl w:val="1"/>
+          <w:numId w:val="2"/>
+        </w:numPr>
+      </w:pPr>
+      <w:r>
+        <w:t>G</w:t>
+      </w:r>
+      <w:r>
+        <w:t>esamtbilanz ganz oben, muss aber bei Reconciliation rausgenommen werden</w:t>
+      </w:r>
+      <w:r>
+        <w:t xml:space="preserve"> </w:t>
+      </w:r>
+      <w:r>
+        <w:t xml:space="preserve">oder </w:t>
+      </w:r>
+      <w:r>
+        <w:t xml:space="preserve">wegen linearer Abhängigkeit </w:t>
+      </w:r>
+      <w:r>
+        <w:t xml:space="preserve">mit </w:t>
+      </w:r>
+      <w:r>
+        <w:t xml:space="preserve">im Recon-Workflow </w:t>
+      </w:r>
+      <w:r>
+        <w:t>behandelt werden</w:t>
+      </w:r>
+    </w:p>
+    <w:p>
+      <w:pPr>
+        <w:pStyle w:val="Listenabsatz"/>
+        <w:numPr>
+          <w:ilvl w:val="0"/>
+          <w:numId w:val="2"/>
+        </w:numPr>
+      </w:pPr>
+      <w:r>
+        <w:t xml:space="preserve">Prüfen </w:t>
+      </w:r>
+      <w:r>
+        <w:t xml:space="preserve">Read_data </w:t>
+      </w:r>
+      <w:r>
+        <w:t>in data balance_ids durch balance_labels ersetzen</w:t>
+      </w:r>
+      <w:r>
+        <w:t xml:space="preserve"> und entsprechende abhängigkeiten im Projekt prüfen</w:t>
+      </w:r>
+    </w:p>
+    <w:p>
+      <w:pPr>
+        <w:pStyle w:val="Listenabsatz"/>
+        <w:numPr>
+          <w:ilvl w:val="0"/>
+          <w:numId w:val="2"/>
+        </w:numPr>
+      </w:pPr>
+      <w:r>
+        <w:t xml:space="preserve"> Stream_labels durch stream_meta ersetzen und schauen wo das noch abhängig ist</w:t>
+      </w:r>
+    </w:p>
+    <w:p/>
+    <w:p>
+      <w:r>
+        <w:t>Morgen Reconciliation kapitel beenden</w:t>
+      </w:r>
+      <w:r>
+        <w:t>, massenbilanz zeigen</w:t>
       </w:r>
     </w:p>
     <w:sectPr>
@@ -969,8 +915,123 @@
       </w:pPr>
     </w:lvl>
   </w:abstractNum>
+  <w:abstractNum w:abstractNumId="1" w15:restartNumberingAfterBreak="0">
+    <w:nsid w:val="1F3B5815"/>
+    <w:multiLevelType w:val="hybridMultilevel"/>
+    <w:tmpl w:val="C98207AE"/>
+    <w:lvl w:ilvl="0" w:tplc="21287152">
+      <w:numFmt w:val="bullet"/>
+      <w:lvlText w:val="-"/>
+      <w:lvlJc w:val="left"/>
+      <w:pPr>
+        <w:ind w:left="720" w:hanging="360"/>
+      </w:pPr>
+      <w:rPr>
+        <w:rFonts w:ascii="Aptos" w:eastAsiaTheme="minorHAnsi" w:hAnsi="Aptos" w:cstheme="minorBidi" w:hint="default"/>
+      </w:rPr>
+    </w:lvl>
+    <w:lvl w:ilvl="1" w:tplc="04070003">
+      <w:start w:val="1"/>
+      <w:numFmt w:val="bullet"/>
+      <w:lvlText w:val="o"/>
+      <w:lvlJc w:val="left"/>
+      <w:pPr>
+        <w:ind w:left="1440" w:hanging="360"/>
+      </w:pPr>
+      <w:rPr>
+        <w:rFonts w:ascii="Courier New" w:hAnsi="Courier New" w:cs="Courier New" w:hint="default"/>
+      </w:rPr>
+    </w:lvl>
+    <w:lvl w:ilvl="2" w:tplc="04070005" w:tentative="1">
+      <w:start w:val="1"/>
+      <w:numFmt w:val="bullet"/>
+      <w:lvlText w:val=""/>
+      <w:lvlJc w:val="left"/>
+      <w:pPr>
+        <w:ind w:left="2160" w:hanging="360"/>
+      </w:pPr>
+      <w:rPr>
+        <w:rFonts w:ascii="Wingdings" w:hAnsi="Wingdings" w:hint="default"/>
+      </w:rPr>
+    </w:lvl>
+    <w:lvl w:ilvl="3" w:tplc="04070001" w:tentative="1">
+      <w:start w:val="1"/>
+      <w:numFmt w:val="bullet"/>
+      <w:lvlText w:val=""/>
+      <w:lvlJc w:val="left"/>
+      <w:pPr>
+        <w:ind w:left="2880" w:hanging="360"/>
+      </w:pPr>
+      <w:rPr>
+        <w:rFonts w:ascii="Symbol" w:hAnsi="Symbol" w:hint="default"/>
+      </w:rPr>
+    </w:lvl>
+    <w:lvl w:ilvl="4" w:tplc="04070003" w:tentative="1">
+      <w:start w:val="1"/>
+      <w:numFmt w:val="bullet"/>
+      <w:lvlText w:val="o"/>
+      <w:lvlJc w:val="left"/>
+      <w:pPr>
+        <w:ind w:left="3600" w:hanging="360"/>
+      </w:pPr>
+      <w:rPr>
+        <w:rFonts w:ascii="Courier New" w:hAnsi="Courier New" w:cs="Courier New" w:hint="default"/>
+      </w:rPr>
+    </w:lvl>
+    <w:lvl w:ilvl="5" w:tplc="04070005" w:tentative="1">
+      <w:start w:val="1"/>
+      <w:numFmt w:val="bullet"/>
+      <w:lvlText w:val=""/>
+      <w:lvlJc w:val="left"/>
+      <w:pPr>
+        <w:ind w:left="4320" w:hanging="360"/>
+      </w:pPr>
+      <w:rPr>
+        <w:rFonts w:ascii="Wingdings" w:hAnsi="Wingdings" w:hint="default"/>
+      </w:rPr>
+    </w:lvl>
+    <w:lvl w:ilvl="6" w:tplc="04070001" w:tentative="1">
+      <w:start w:val="1"/>
+      <w:numFmt w:val="bullet"/>
+      <w:lvlText w:val=""/>
+      <w:lvlJc w:val="left"/>
+      <w:pPr>
+        <w:ind w:left="5040" w:hanging="360"/>
+      </w:pPr>
+      <w:rPr>
+        <w:rFonts w:ascii="Symbol" w:hAnsi="Symbol" w:hint="default"/>
+      </w:rPr>
+    </w:lvl>
+    <w:lvl w:ilvl="7" w:tplc="04070003" w:tentative="1">
+      <w:start w:val="1"/>
+      <w:numFmt w:val="bullet"/>
+      <w:lvlText w:val="o"/>
+      <w:lvlJc w:val="left"/>
+      <w:pPr>
+        <w:ind w:left="5760" w:hanging="360"/>
+      </w:pPr>
+      <w:rPr>
+        <w:rFonts w:ascii="Courier New" w:hAnsi="Courier New" w:cs="Courier New" w:hint="default"/>
+      </w:rPr>
+    </w:lvl>
+    <w:lvl w:ilvl="8" w:tplc="04070005" w:tentative="1">
+      <w:start w:val="1"/>
+      <w:numFmt w:val="bullet"/>
+      <w:lvlText w:val=""/>
+      <w:lvlJc w:val="left"/>
+      <w:pPr>
+        <w:ind w:left="6480" w:hanging="360"/>
+      </w:pPr>
+      <w:rPr>
+        <w:rFonts w:ascii="Wingdings" w:hAnsi="Wingdings" w:hint="default"/>
+      </w:rPr>
+    </w:lvl>
+  </w:abstractNum>
   <w:num w:numId="1" w16cid:durableId="1853185280">
     <w:abstractNumId w:val="0"/>
+  </w:num>
+  <w:num w:numId="2" w16cid:durableId="1933321531">
+    <w:abstractNumId w:val="1"/>
   </w:num>
 </w:numbering>
 </file>

</xml_diff>

<commit_message>
fix: keine balance_id wird durch compute_mass_balance durchgereicht
</commit_message>
<xml_diff>
--- a/Projektbeschreibung.docx
+++ b/Projektbeschreibung.docx
@@ -772,40 +772,6 @@
         <w:t>behandelt werden</w:t>
       </w:r>
     </w:p>
-    <w:p>
-      <w:pPr>
-        <w:pStyle w:val="Listenabsatz"/>
-        <w:numPr>
-          <w:ilvl w:val="0"/>
-          <w:numId w:val="2"/>
-        </w:numPr>
-      </w:pPr>
-      <w:r>
-        <w:t xml:space="preserve">Prüfen </w:t>
-      </w:r>
-      <w:r>
-        <w:t xml:space="preserve">Read_data </w:t>
-      </w:r>
-      <w:r>
-        <w:t>in data balance_ids durch balance_labels ersetzen</w:t>
-      </w:r>
-      <w:r>
-        <w:t xml:space="preserve"> und entsprechende abhängigkeiten im Projekt prüfen</w:t>
-      </w:r>
-    </w:p>
-    <w:p>
-      <w:pPr>
-        <w:pStyle w:val="Listenabsatz"/>
-        <w:numPr>
-          <w:ilvl w:val="0"/>
-          <w:numId w:val="2"/>
-        </w:numPr>
-      </w:pPr>
-      <w:r>
-        <w:t xml:space="preserve"> Stream_labels durch stream_meta ersetzen und schauen wo das noch abhängig ist</w:t>
-      </w:r>
-    </w:p>
-    <w:p/>
     <w:p>
       <w:r>
         <w:t>Morgen Reconciliation kapitel beenden</w:t>

</xml_diff>